<commit_message>
Describir brevemente lo que hiciste
</commit_message>
<xml_diff>
--- a/QUE DEBEN HACER LOS COLABORADORES.docx
+++ b/QUE DEBEN HACER LOS COLABORADORES.docx
@@ -2,6 +2,227 @@
 <file path=word/document.xml><?xml version="1.0" encoding="utf-8"?>
 <w:document xmlns:wpc="http://schemas.microsoft.com/office/word/2010/wordprocessingCanvas" xmlns:cx="http://schemas.microsoft.com/office/drawing/2014/chartex" xmlns:cx1="http://schemas.microsoft.com/office/drawing/2015/9/8/chartex" xmlns:cx2="http://schemas.microsoft.com/office/drawing/2015/10/21/chartex" xmlns:cx3="http://schemas.microsoft.com/office/drawing/2016/5/9/chartex" xmlns:cx4="http://schemas.microsoft.com/office/drawing/2016/5/10/chartex" xmlns:cx5="http://schemas.microsoft.com/office/drawing/2016/5/11/chartex" xmlns:cx6="http://schemas.microsoft.com/office/drawing/2016/5/12/chartex" xmlns:cx7="http://schemas.microsoft.com/office/drawing/2016/5/13/chartex" xmlns:cx8="http://schemas.microsoft.com/office/drawing/2016/5/14/chartex" xmlns:mc="http://schemas.openxmlformats.org/markup-compatibility/2006" xmlns:aink="http://schemas.microsoft.com/office/drawing/2016/ink" xmlns:am3d="http://schemas.microsoft.com/office/drawing/2017/model3d" xmlns:o="urn:schemas-microsoft-com:office:office" xmlns:oel="http://schemas.microsoft.com/office/2019/extlst" xmlns:r="http://schemas.openxmlformats.org/officeDocument/2006/relationships" xmlns:m="http://schemas.openxmlformats.org/officeDocument/2006/math" xmlns:v="urn:schemas-microsoft-com:vml" xmlns:wp14="http://schemas.microsoft.com/office/word/2010/wordprocessingDrawing" xmlns:wp="http://schemas.openxmlformats.org/drawingml/2006/wordprocessingDrawing" xmlns:w10="urn:schemas-microsoft-com:office:word" xmlns:w="http://schemas.openxmlformats.org/wordprocessingml/2006/main" xmlns:w14="http://schemas.microsoft.com/office/word/2010/wordml" xmlns:w15="http://schemas.microsoft.com/office/word/2012/wordml" xmlns:w16cex="http://schemas.microsoft.com/office/word/2018/wordml/cex" xmlns:w16cid="http://schemas.microsoft.com/office/word/2016/wordml/cid" xmlns:w16="http://schemas.microsoft.com/office/word/2018/wordml" xmlns:w16du="http://schemas.microsoft.com/office/word/2023/wordml/word16du" xmlns:w16sdtdh="http://schemas.microsoft.com/office/word/2020/wordml/sdtdatahash" xmlns:w16sdtfl="http://schemas.microsoft.com/office/word/2024/wordml/sdtformatlock" xmlns:w16se="http://schemas.microsoft.com/office/word/2015/wordml/symex" xmlns:wpg="http://schemas.microsoft.com/office/word/2010/wordprocessingGroup" xmlns:wpi="http://schemas.microsoft.com/office/word/2010/wordprocessingInk" xmlns:wne="http://schemas.microsoft.com/office/word/2006/wordml" xmlns:wps="http://schemas.microsoft.com/office/word/2010/wordprocessingShape" mc:Ignorable="w14 w15 w16se w16cid w16 w16cex w16sdtdh w16sdtfl w16du wp14">
   <w:body>
+    <w:p>
+      <w:r>
+        <w:t>El flujo de trabajo colaborativo será:</w:t>
+      </w:r>
+    </w:p>
+    <w:p>
+      <w:pPr>
+        <w:numPr>
+          <w:ilvl w:val="0"/>
+          <w:numId w:val="5"/>
+        </w:numPr>
+      </w:pPr>
+      <w:r>
+        <w:rPr>
+          <w:b/>
+          <w:bCs/>
+        </w:rPr>
+        <w:t>Antes de empezar a trabajar (o cada vez que quieran las actualizaciones de los demás):</w:t>
+      </w:r>
+      <w:r>
+        <w:t xml:space="preserve"> </w:t>
+      </w:r>
+      <w:proofErr w:type="spellStart"/>
+      <w:r>
+        <w:t>git</w:t>
+      </w:r>
+      <w:proofErr w:type="spellEnd"/>
+      <w:r>
+        <w:t xml:space="preserve"> </w:t>
+      </w:r>
+      <w:proofErr w:type="spellStart"/>
+      <w:r>
+        <w:t>pull</w:t>
+      </w:r>
+      <w:proofErr w:type="spellEnd"/>
+      <w:r>
+        <w:t xml:space="preserve"> </w:t>
+      </w:r>
+      <w:proofErr w:type="spellStart"/>
+      <w:r>
+        <w:t>origin</w:t>
+      </w:r>
+      <w:proofErr w:type="spellEnd"/>
+      <w:r>
+        <w:t xml:space="preserve"> </w:t>
+      </w:r>
+      <w:proofErr w:type="spellStart"/>
+      <w:r>
+        <w:t>main</w:t>
+      </w:r>
+      <w:proofErr w:type="spellEnd"/>
+      <w:r>
+        <w:t xml:space="preserve"> (en la terminal dentro de la carpeta LAS3J).</w:t>
+      </w:r>
+    </w:p>
+    <w:p>
+      <w:pPr>
+        <w:numPr>
+          <w:ilvl w:val="0"/>
+          <w:numId w:val="5"/>
+        </w:numPr>
+      </w:pPr>
+      <w:r>
+        <w:rPr>
+          <w:b/>
+          <w:bCs/>
+        </w:rPr>
+        <w:t xml:space="preserve">Hacer sus cambios en </w:t>
+      </w:r>
+      <w:proofErr w:type="spellStart"/>
+      <w:r>
+        <w:rPr>
+          <w:b/>
+          <w:bCs/>
+        </w:rPr>
+        <w:t>Unreal</w:t>
+      </w:r>
+      <w:proofErr w:type="spellEnd"/>
+      <w:r>
+        <w:rPr>
+          <w:b/>
+          <w:bCs/>
+        </w:rPr>
+        <w:t xml:space="preserve"> </w:t>
+      </w:r>
+      <w:proofErr w:type="spellStart"/>
+      <w:r>
+        <w:rPr>
+          <w:b/>
+          <w:bCs/>
+        </w:rPr>
+        <w:t>Engine</w:t>
+      </w:r>
+      <w:proofErr w:type="spellEnd"/>
+      <w:r>
+        <w:rPr>
+          <w:b/>
+          <w:bCs/>
+        </w:rPr>
+        <w:t xml:space="preserve"> y guardar el proyecto.</w:t>
+      </w:r>
+    </w:p>
+    <w:p>
+      <w:pPr>
+        <w:numPr>
+          <w:ilvl w:val="0"/>
+          <w:numId w:val="5"/>
+        </w:numPr>
+      </w:pPr>
+      <w:r>
+        <w:rPr>
+          <w:b/>
+          <w:bCs/>
+        </w:rPr>
+        <w:t>Guardar sus cambios en Git:</w:t>
+      </w:r>
+      <w:r>
+        <w:t xml:space="preserve"> </w:t>
+      </w:r>
+    </w:p>
+    <w:p>
+      <w:pPr>
+        <w:numPr>
+          <w:ilvl w:val="1"/>
+          <w:numId w:val="5"/>
+        </w:numPr>
+      </w:pPr>
+      <w:proofErr w:type="spellStart"/>
+      <w:r>
+        <w:t>git</w:t>
+      </w:r>
+      <w:proofErr w:type="spellEnd"/>
+      <w:r>
+        <w:t xml:space="preserve"> </w:t>
+      </w:r>
+      <w:proofErr w:type="spellStart"/>
+      <w:proofErr w:type="gramStart"/>
+      <w:r>
+        <w:t>add</w:t>
+      </w:r>
+      <w:proofErr w:type="spellEnd"/>
+      <w:r>
+        <w:t xml:space="preserve"> .</w:t>
+      </w:r>
+      <w:proofErr w:type="gramEnd"/>
+      <w:r>
+        <w:t xml:space="preserve"> (para añadir todos los archivos modificados/nuevos/eliminados)</w:t>
+      </w:r>
+    </w:p>
+    <w:p>
+      <w:pPr>
+        <w:numPr>
+          <w:ilvl w:val="1"/>
+          <w:numId w:val="5"/>
+        </w:numPr>
+      </w:pPr>
+      <w:proofErr w:type="spellStart"/>
+      <w:r>
+        <w:t>git</w:t>
+      </w:r>
+      <w:proofErr w:type="spellEnd"/>
+      <w:r>
+        <w:t xml:space="preserve"> </w:t>
+      </w:r>
+      <w:proofErr w:type="spellStart"/>
+      <w:r>
+        <w:t>commit</w:t>
+      </w:r>
+      <w:proofErr w:type="spellEnd"/>
+      <w:r>
+        <w:t xml:space="preserve"> -m "Mensaje descriptivo de los cambios realizados"</w:t>
+      </w:r>
+    </w:p>
+    <w:p>
+      <w:pPr>
+        <w:numPr>
+          <w:ilvl w:val="0"/>
+          <w:numId w:val="5"/>
+        </w:numPr>
+      </w:pPr>
+      <w:r>
+        <w:rPr>
+          <w:b/>
+          <w:bCs/>
+        </w:rPr>
+        <w:t>Subir sus cambios a GitHub:</w:t>
+      </w:r>
+      <w:r>
+        <w:t xml:space="preserve"> </w:t>
+      </w:r>
+      <w:proofErr w:type="spellStart"/>
+      <w:r>
+        <w:t>git</w:t>
+      </w:r>
+      <w:proofErr w:type="spellEnd"/>
+      <w:r>
+        <w:t xml:space="preserve"> </w:t>
+      </w:r>
+      <w:proofErr w:type="spellStart"/>
+      <w:r>
+        <w:t>push</w:t>
+      </w:r>
+      <w:proofErr w:type="spellEnd"/>
+      <w:r>
+        <w:t xml:space="preserve"> </w:t>
+      </w:r>
+      <w:proofErr w:type="spellStart"/>
+      <w:r>
+        <w:t>origin</w:t>
+      </w:r>
+      <w:proofErr w:type="spellEnd"/>
+      <w:r>
+        <w:t xml:space="preserve"> </w:t>
+      </w:r>
+      <w:proofErr w:type="spellStart"/>
+      <w:r>
+        <w:t>main</w:t>
+      </w:r>
+      <w:proofErr w:type="spellEnd"/>
+    </w:p>
+    <w:p/>
     <w:p>
       <w:r>
         <w:t>QUE DEBEN HACER LOS COLABORADORES</w:t>
@@ -95,10 +316,7 @@
     <w:p/>
     <w:p>
       <w:r>
-        <w:t>2. Clonar el repositorio</w:t>
-      </w:r>
-      <w:r>
-        <w:t xml:space="preserve"> y(o)</w:t>
+        <w:t>2. Clonar el repositorio y(o)</w:t>
       </w:r>
     </w:p>
     <w:p>
@@ -230,7 +448,6 @@
     <w:p/>
     <w:p>
       <w:r>
-        <w:lastRenderedPageBreak/>
         <w:t>Haz tus cambios y luego:</w:t>
       </w:r>
     </w:p>
@@ -460,6 +677,7 @@
     <w:p/>
     <w:p>
       <w:r>
+        <w:lastRenderedPageBreak/>
         <w:t xml:space="preserve">Después de instalar, abre una nueva ventana de </w:t>
       </w:r>
       <w:r>
@@ -558,7 +776,6 @@
     <w:p/>
     <w:p>
       <w:r>
-        <w:lastRenderedPageBreak/>
         <w:t>Clona el repositorio</w:t>
       </w:r>
     </w:p>
@@ -696,6 +913,7 @@
         </w:numPr>
       </w:pPr>
       <w:r>
+        <w:lastRenderedPageBreak/>
         <w:t xml:space="preserve">Presiona Windows + S, escribe </w:t>
       </w:r>
       <w:r>
@@ -864,7 +1082,6 @@
           <w:b/>
           <w:bCs/>
         </w:rPr>
-        <w:lastRenderedPageBreak/>
         <w:t>Reinicia CMD o PowerShell</w:t>
       </w:r>
     </w:p>
@@ -1040,6 +1257,7 @@
     </w:p>
     <w:p>
       <w:r>
+        <w:lastRenderedPageBreak/>
         <w:t>Si no eres colaborador o el dueño del repo no te dio acceso, verás este error.</w:t>
       </w:r>
     </w:p>
@@ -1149,7 +1367,6 @@
           <w:b/>
           <w:bCs/>
         </w:rPr>
-        <w:lastRenderedPageBreak/>
         <w:t>SOLUCIÓN: Configurar tu usuario en Git</w:t>
       </w:r>
     </w:p>
@@ -1558,6 +1775,155 @@
     </w:lvl>
   </w:abstractNum>
   <w:abstractNum w:abstractNumId="2" w15:restartNumberingAfterBreak="0">
+    <w:nsid w:val="1DE57F66"/>
+    <w:multiLevelType w:val="multilevel"/>
+    <w:tmpl w:val="6D2C8E80"/>
+    <w:lvl w:ilvl="0">
+      <w:start w:val="1"/>
+      <w:numFmt w:val="bullet"/>
+      <w:lvlText w:val=""/>
+      <w:lvlJc w:val="left"/>
+      <w:pPr>
+        <w:tabs>
+          <w:tab w:val="num" w:pos="720"/>
+        </w:tabs>
+        <w:ind w:left="720" w:hanging="360"/>
+      </w:pPr>
+      <w:rPr>
+        <w:rFonts w:ascii="Symbol" w:hAnsi="Symbol" w:hint="default"/>
+        <w:sz w:val="20"/>
+      </w:rPr>
+    </w:lvl>
+    <w:lvl w:ilvl="1">
+      <w:start w:val="1"/>
+      <w:numFmt w:val="bullet"/>
+      <w:lvlText w:val="o"/>
+      <w:lvlJc w:val="left"/>
+      <w:pPr>
+        <w:tabs>
+          <w:tab w:val="num" w:pos="1440"/>
+        </w:tabs>
+        <w:ind w:left="1440" w:hanging="360"/>
+      </w:pPr>
+      <w:rPr>
+        <w:rFonts w:ascii="Courier New" w:hAnsi="Courier New" w:hint="default"/>
+        <w:sz w:val="20"/>
+      </w:rPr>
+    </w:lvl>
+    <w:lvl w:ilvl="2" w:tentative="1">
+      <w:start w:val="1"/>
+      <w:numFmt w:val="bullet"/>
+      <w:lvlText w:val=""/>
+      <w:lvlJc w:val="left"/>
+      <w:pPr>
+        <w:tabs>
+          <w:tab w:val="num" w:pos="2160"/>
+        </w:tabs>
+        <w:ind w:left="2160" w:hanging="360"/>
+      </w:pPr>
+      <w:rPr>
+        <w:rFonts w:ascii="Wingdings" w:hAnsi="Wingdings" w:hint="default"/>
+        <w:sz w:val="20"/>
+      </w:rPr>
+    </w:lvl>
+    <w:lvl w:ilvl="3" w:tentative="1">
+      <w:start w:val="1"/>
+      <w:numFmt w:val="bullet"/>
+      <w:lvlText w:val=""/>
+      <w:lvlJc w:val="left"/>
+      <w:pPr>
+        <w:tabs>
+          <w:tab w:val="num" w:pos="2880"/>
+        </w:tabs>
+        <w:ind w:left="2880" w:hanging="360"/>
+      </w:pPr>
+      <w:rPr>
+        <w:rFonts w:ascii="Wingdings" w:hAnsi="Wingdings" w:hint="default"/>
+        <w:sz w:val="20"/>
+      </w:rPr>
+    </w:lvl>
+    <w:lvl w:ilvl="4" w:tentative="1">
+      <w:start w:val="1"/>
+      <w:numFmt w:val="bullet"/>
+      <w:lvlText w:val=""/>
+      <w:lvlJc w:val="left"/>
+      <w:pPr>
+        <w:tabs>
+          <w:tab w:val="num" w:pos="3600"/>
+        </w:tabs>
+        <w:ind w:left="3600" w:hanging="360"/>
+      </w:pPr>
+      <w:rPr>
+        <w:rFonts w:ascii="Wingdings" w:hAnsi="Wingdings" w:hint="default"/>
+        <w:sz w:val="20"/>
+      </w:rPr>
+    </w:lvl>
+    <w:lvl w:ilvl="5" w:tentative="1">
+      <w:start w:val="1"/>
+      <w:numFmt w:val="bullet"/>
+      <w:lvlText w:val=""/>
+      <w:lvlJc w:val="left"/>
+      <w:pPr>
+        <w:tabs>
+          <w:tab w:val="num" w:pos="4320"/>
+        </w:tabs>
+        <w:ind w:left="4320" w:hanging="360"/>
+      </w:pPr>
+      <w:rPr>
+        <w:rFonts w:ascii="Wingdings" w:hAnsi="Wingdings" w:hint="default"/>
+        <w:sz w:val="20"/>
+      </w:rPr>
+    </w:lvl>
+    <w:lvl w:ilvl="6" w:tentative="1">
+      <w:start w:val="1"/>
+      <w:numFmt w:val="bullet"/>
+      <w:lvlText w:val=""/>
+      <w:lvlJc w:val="left"/>
+      <w:pPr>
+        <w:tabs>
+          <w:tab w:val="num" w:pos="5040"/>
+        </w:tabs>
+        <w:ind w:left="5040" w:hanging="360"/>
+      </w:pPr>
+      <w:rPr>
+        <w:rFonts w:ascii="Wingdings" w:hAnsi="Wingdings" w:hint="default"/>
+        <w:sz w:val="20"/>
+      </w:rPr>
+    </w:lvl>
+    <w:lvl w:ilvl="7" w:tentative="1">
+      <w:start w:val="1"/>
+      <w:numFmt w:val="bullet"/>
+      <w:lvlText w:val=""/>
+      <w:lvlJc w:val="left"/>
+      <w:pPr>
+        <w:tabs>
+          <w:tab w:val="num" w:pos="5760"/>
+        </w:tabs>
+        <w:ind w:left="5760" w:hanging="360"/>
+      </w:pPr>
+      <w:rPr>
+        <w:rFonts w:ascii="Wingdings" w:hAnsi="Wingdings" w:hint="default"/>
+        <w:sz w:val="20"/>
+      </w:rPr>
+    </w:lvl>
+    <w:lvl w:ilvl="8" w:tentative="1">
+      <w:start w:val="1"/>
+      <w:numFmt w:val="bullet"/>
+      <w:lvlText w:val=""/>
+      <w:lvlJc w:val="left"/>
+      <w:pPr>
+        <w:tabs>
+          <w:tab w:val="num" w:pos="6480"/>
+        </w:tabs>
+        <w:ind w:left="6480" w:hanging="360"/>
+      </w:pPr>
+      <w:rPr>
+        <w:rFonts w:ascii="Wingdings" w:hAnsi="Wingdings" w:hint="default"/>
+        <w:sz w:val="20"/>
+      </w:rPr>
+    </w:lvl>
+  </w:abstractNum>
+  <w:abstractNum w:abstractNumId="3" w15:restartNumberingAfterBreak="0">
     <w:nsid w:val="368F4D8D"/>
     <w:multiLevelType w:val="multilevel"/>
     <w:tmpl w:val="AA5C012A"/>
@@ -1706,7 +2072,7 @@
       </w:rPr>
     </w:lvl>
   </w:abstractNum>
-  <w:abstractNum w:abstractNumId="3" w15:restartNumberingAfterBreak="0">
+  <w:abstractNum w:abstractNumId="4" w15:restartNumberingAfterBreak="0">
     <w:nsid w:val="74CC0B6F"/>
     <w:multiLevelType w:val="multilevel"/>
     <w:tmpl w:val="C37E5158"/>
@@ -1856,7 +2222,7 @@
     </w:lvl>
   </w:abstractNum>
   <w:num w:numId="1" w16cid:durableId="299187263">
-    <w:abstractNumId w:val="3"/>
+    <w:abstractNumId w:val="4"/>
   </w:num>
   <w:num w:numId="2" w16cid:durableId="1140730446">
     <w:abstractNumId w:val="0"/>
@@ -1865,6 +2231,9 @@
     <w:abstractNumId w:val="1"/>
   </w:num>
   <w:num w:numId="4" w16cid:durableId="2107531674">
+    <w:abstractNumId w:val="3"/>
+  </w:num>
+  <w:num w:numId="5" w16cid:durableId="600451592">
     <w:abstractNumId w:val="2"/>
   </w:num>
 </w:numbering>

</xml_diff>